<commit_message>
Fix: Alerta sesion expirada solo cuando realmente expiro, no en visita inicial
</commit_message>
<xml_diff>
--- a/plantillas/MODIFICACION_2_ACEPTACION.docx
+++ b/plantillas/MODIFICACION_2_ACEPTACION.docx
@@ -2883,8 +2883,6 @@
         </w:rPr>
         <w:t>{{FECHA_FINAL_ADICIONAL}}</w:t>
       </w:r>
-      <w:bookmarkStart w:id="0" w:name="_GoBack"/>
-      <w:bookmarkEnd w:id="0"/>
       <w:r>
         <w:rPr>
           <w:rFonts w:ascii="Arial" w:hAnsi="Arial" w:cs="Arial"/>
@@ -4680,10 +4678,28 @@
           <w:rFonts w:ascii="Arial" w:hAnsi="Arial" w:cs="Arial"/>
           <w:sz w:val="24"/>
           <w:szCs w:val="24"/>
+        </w:rPr>
+        <w:t>(</w:t>
+      </w:r>
+      <w:r>
+        <w:rPr>
+          <w:rFonts w:ascii="Arial" w:hAnsi="Arial" w:cs="Arial"/>
+          <w:sz w:val="24"/>
+          <w:szCs w:val="24"/>
           <w:highlight w:val="yellow"/>
         </w:rPr>
         <w:t>{{NUMERO_CUOTAS_ADICION}}</w:t>
       </w:r>
+      <w:r>
+        <w:rPr>
+          <w:rFonts w:ascii="Arial" w:hAnsi="Arial" w:cs="Arial"/>
+          <w:sz w:val="24"/>
+          <w:szCs w:val="24"/>
+        </w:rPr>
+        <w:t>)</w:t>
+      </w:r>
+      <w:bookmarkStart w:id="0" w:name="_GoBack"/>
+      <w:bookmarkEnd w:id="0"/>
       <w:r>
         <w:rPr>
           <w:rFonts w:ascii="Arial" w:hAnsi="Arial" w:cs="Arial"/>
@@ -6195,7 +6211,7 @@
         <w:sz w:val="16"/>
         <w:szCs w:val="16"/>
       </w:rPr>
-      <w:t>3</w:t>
+      <w:t>7</w:t>
     </w:r>
     <w:r>
       <w:rPr>
@@ -10465,7 +10481,7 @@
 </file>
 
 <file path=customXml/itemProps1.xml><?xml version="1.0" encoding="utf-8"?>
-<ds:datastoreItem xmlns:ds="http://schemas.openxmlformats.org/officeDocument/2006/customXml" ds:itemID="{E5EB1743-EA46-4209-80DE-DCC286AEC9CA}">
+<ds:datastoreItem xmlns:ds="http://schemas.openxmlformats.org/officeDocument/2006/customXml" ds:itemID="{5868259B-41AA-44AD-9FF2-87B511109624}">
   <ds:schemaRefs>
     <ds:schemaRef ds:uri="http://schemas.openxmlformats.org/officeDocument/2006/bibliography"/>
   </ds:schemaRefs>

</xml_diff>